<commit_message>
Refresh skill map for May 2026 Tier-1 build pass
- Bump D&W skill count 37 -> 41 (Table 0 + headings)
- Add dw-client-intake-interview to Intake & Case Management (Table 1)
- Add dw-jail-call-analyzer to Evidence Auditors (Table 3)
- Add dw-trial-day-assistant to Trial Preparation (Table 6)
- Add dw-appellate-brief-builder + dw-post-conviction-relief to
  Sentencing & Post-Trial (Table 7) — the latter was missing from the
  prior map
- Add dw-violent-crime-specialist plus the three previously-missing
  charge-type specialists (drug, DWI, firearms) to the Specialized
  table (Table 8); rename to "Charge-Type Specialists & Specialized"
- Remove dw-lwop-populator row (retired into dw-criminal-defense v5.3)
- Update revision date to May 2, 2026; rewrite the executive-summary
  paragraph that referenced the stale "37" count

https://claude.ai/code/session_01McPYRox6yGeSE764XiJrGr
</commit_message>
<xml_diff>
--- a/docs/Updated_Skill_Map_March_2026.docx
+++ b/docs/Updated_Skill_Map_March_2026.docx
@@ -35,12 +35,7 @@
         <w:spacing w:after="80"/>
       </w:pPr>
       <w:r>
-        <w:rPr>
-          <w:i/>
-          <w:iCs/>
-          <w:color w:val="666666"/>
-        </w:rPr>
-        <w:t>March 21, 2026</w:t>
+        <w:t>May 2, 2026</w:t>
       </w:r>
     </w:p>
     <w:p>
@@ -48,15 +43,7 @@
         <w:spacing w:after="200"/>
       </w:pPr>
       <w:r>
-        <w:t xml:space="preserve">Revision of the March 20, </w:t>
-      </w:r>
-      <w:proofErr w:type="gramStart"/>
-      <w:r>
-        <w:t>2026</w:t>
-      </w:r>
-      <w:proofErr w:type="gramEnd"/>
-      <w:r>
-        <w:t xml:space="preserve"> Skill Map, reflecting folder cleanup completed March 21, 2026.</w:t>
+        <w:t>Revision of the March 21, 2026 Skill Map, reflecting the May 2026 Tier-1 build pass: 5 new skills added (dw-client-intake-interview, dw-jail-call-analyzer, dw-trial-day-assistant, dw-appellate-brief-builder, dw-violent-crime-specialist), Daubert/Foret Hearing Day Package extension to dw-expert-witness-evaluator (Module I), and registry wiring (dw-skill-index v1.1, dw-template-selector v1.2, dw-criminal-defense v5.4).</w:t>
       </w:r>
     </w:p>
     <w:p>
@@ -64,11 +51,7 @@
         <w:spacing w:after="120"/>
       </w:pPr>
       <w:r>
-        <w:rPr>
-          <w:b/>
-          <w:bCs/>
-        </w:rPr>
-        <w:t>37 D&amp;W Skills • 13 Utility Skills • 6 Plugins (59+ skills) • 9 MCP Servers (89+ tools)</w:t>
+        <w:t>41 D&amp;W Skills • 13 Utility Skills • 6 Plugins (59+ skills) • 9 MCP Servers (89+ tools)</w:t>
       </w:r>
     </w:p>
     <w:p>
@@ -89,23 +72,7 @@
         <w:spacing w:after="120"/>
       </w:pPr>
       <w:r>
-        <w:t xml:space="preserve">This is the canonical skill map as of March 21, 2026. All cleanup actions from the March 19 audit and March 20 skill map have been fully executed, and on March 21 we completed a comprehensive folder cleanup removing 48 old .skill package files, two duplicate library folders (master-skills and _master-skills-library containing 108 combined subfolders), the _archived folder with 6 deprecated skills and 2 actioned cleanup guides, and miscellaneous artifacts (docx.skill.zip, empty </w:t>
-      </w:r>
-      <w:proofErr w:type="spellStart"/>
-      <w:r>
-        <w:t>cowork</w:t>
-      </w:r>
-      <w:proofErr w:type="spellEnd"/>
-      <w:r>
-        <w:t>-imports, process-sop-</w:t>
-      </w:r>
-      <w:proofErr w:type="spellStart"/>
-      <w:r>
-        <w:t>writer.skill</w:t>
-      </w:r>
-      <w:proofErr w:type="spellEnd"/>
-      <w:r>
-        <w:t>).</w:t>
+        <w:t>This is the canonical skill map as of May 2, 2026. Net +4 D&amp;W skills since March 21 (5 added, 1 retired). All five new Tier-1 gap skills follow the established frontmatter + Step 0 + Step 0.5 + Step 1 + lettered modules + source citation + output paths pattern.</w:t>
       </w:r>
     </w:p>
     <w:p>
@@ -113,63 +80,7 @@
         <w:spacing w:after="120"/>
       </w:pPr>
       <w:r>
-        <w:t xml:space="preserve">The D&amp;W skill count is now 37, up from the original audit’s recommended 33. The three additions beyond the audit’s recommendation fill genuine gaps: </w:t>
-      </w:r>
-      <w:proofErr w:type="spellStart"/>
-      <w:r>
-        <w:t>dw</w:t>
-      </w:r>
-      <w:proofErr w:type="spellEnd"/>
-      <w:r>
-        <w:t xml:space="preserve">-case-dashboard (case status), </w:t>
-      </w:r>
-      <w:proofErr w:type="spellStart"/>
-      <w:r>
-        <w:t>dw</w:t>
-      </w:r>
-      <w:proofErr w:type="spellEnd"/>
-      <w:r>
-        <w:t>-discovery-orchestrator (discovery triage), and the three-skill transcript router system (</w:t>
-      </w:r>
-      <w:proofErr w:type="spellStart"/>
-      <w:r>
-        <w:t>dw</w:t>
-      </w:r>
-      <w:proofErr w:type="spellEnd"/>
-      <w:r>
-        <w:t xml:space="preserve">-transcript-router, </w:t>
-      </w:r>
-      <w:proofErr w:type="spellStart"/>
-      <w:r>
-        <w:t>dw</w:t>
-      </w:r>
-      <w:proofErr w:type="spellEnd"/>
-      <w:r>
-        <w:t>-transcript-pipeline-</w:t>
-      </w:r>
-      <w:proofErr w:type="spellStart"/>
-      <w:r>
-        <w:t>calcasieu</w:t>
-      </w:r>
-      <w:proofErr w:type="spellEnd"/>
-      <w:r>
-        <w:t xml:space="preserve">, </w:t>
-      </w:r>
-      <w:proofErr w:type="spellStart"/>
-      <w:r>
-        <w:t>dw</w:t>
-      </w:r>
-      <w:proofErr w:type="spellEnd"/>
-      <w:r>
-        <w:t xml:space="preserve">-transcript-pipeline-rev) which replaced the former monolithic </w:t>
-      </w:r>
-      <w:proofErr w:type="spellStart"/>
-      <w:r>
-        <w:t>dw</w:t>
-      </w:r>
-      <w:proofErr w:type="spellEnd"/>
-      <w:r>
-        <w:t>-transcript-pipeline with parish-based routing.</w:t>
+        <w:t>The D&amp;W skill count is now 41 after the May 2026 Tier-1 build pass. Five new skills were added (dw-client-intake-interview, dw-jail-call-analyzer, dw-trial-day-assistant, dw-appellate-brief-builder, dw-violent-crime-specialist) and dw-lwop-populator was retired (its functionality merged into dw-criminal-defense Phase 1 Step 3 in v5.3). The Daubert/Foret hearing day operational deliverables were added to dw-expert-witness-evaluator as Module I rather than as a separate skill, after audit verification confirmed the existing skill already covered the doctrinal motion-stage analysis.</w:t>
       </w:r>
     </w:p>
     <w:p>
@@ -344,11 +255,7 @@
           </w:tcPr>
           <w:p>
             <w:r>
-              <w:rPr>
-                <w:sz w:val="20"/>
-                <w:szCs w:val="20"/>
-              </w:rPr>
-              <w:t>37</w:t>
+              <w:t>41</w:t>
             </w:r>
           </w:p>
         </w:tc>
@@ -370,11 +277,7 @@
           </w:tcPr>
           <w:p>
             <w:r>
-              <w:rPr>
-                <w:sz w:val="20"/>
-                <w:szCs w:val="20"/>
-              </w:rPr>
-              <w:t>Organized across 8 practice phases</w:t>
+              <w:t>Organized across 8 practice phases (May 2026: +5 new, -1 retired)</w:t>
             </w:r>
           </w:p>
         </w:tc>
@@ -834,12 +737,7 @@
         <w:spacing w:before="200" w:after="120"/>
       </w:pPr>
       <w:r>
-        <w:rPr>
-          <w:sz w:val="22"/>
-          <w:szCs w:val="22"/>
-        </w:rPr>
-        <w:lastRenderedPageBreak/>
-        <w:t>D&amp;W Criminal Defense Skills (37)</w:t>
+        <w:t>D&amp;W Criminal Defense Skills (41)</w:t>
       </w:r>
     </w:p>
     <w:p>
@@ -848,11 +746,7 @@
         <w:spacing w:before="200"/>
       </w:pPr>
       <w:r>
-        <w:rPr>
-          <w:sz w:val="22"/>
-          <w:szCs w:val="22"/>
-        </w:rPr>
-        <w:t>Intake &amp; Case Management (4)</w:t>
+        <w:t>Intake &amp; Case Management (5)</w:t>
       </w:r>
     </w:p>
     <w:tbl>
@@ -1343,6 +1237,38 @@
                 <w:szCs w:val="20"/>
               </w:rPr>
               <w:t>4K</w:t>
+            </w:r>
+          </w:p>
+        </w:tc>
+      </w:tr>
+      <w:tr>
+        <w:tc>
+          <w:tcPr>
+            <w:tcW w:type="dxa" w:w="2600"/>
+          </w:tcPr>
+          <w:p>
+            <w:r>
+              <w:t>dw-client-intake-interview</w:t>
+            </w:r>
+          </w:p>
+        </w:tc>
+        <w:tc>
+          <w:tcPr>
+            <w:tcW w:type="dxa" w:w="5200"/>
+          </w:tcPr>
+          <w:p>
+            <w:r>
+              <w:t>Client intake interview, conflict check, immediate-action triage, charge-type dispatcher</w:t>
+            </w:r>
+          </w:p>
+        </w:tc>
+        <w:tc>
+          <w:tcPr>
+            <w:tcW w:type="dxa" w:w="1560"/>
+          </w:tcPr>
+          <w:p>
+            <w:r>
+              <w:t>92K</w:t>
             </w:r>
           </w:p>
         </w:tc>
@@ -1768,11 +1694,7 @@
         <w:spacing w:before="200"/>
       </w:pPr>
       <w:r>
-        <w:rPr>
-          <w:sz w:val="22"/>
-          <w:szCs w:val="22"/>
-        </w:rPr>
-        <w:t>Evidence Auditors (9)</w:t>
+        <w:t>Evidence Auditors (10)</w:t>
       </w:r>
     </w:p>
     <w:tbl>
@@ -2730,6 +2652,38 @@
                 <w:szCs w:val="20"/>
               </w:rPr>
               <w:t>84K</w:t>
+            </w:r>
+          </w:p>
+        </w:tc>
+      </w:tr>
+      <w:tr>
+        <w:tc>
+          <w:tcPr>
+            <w:tcW w:type="dxa" w:w="2600"/>
+          </w:tcPr>
+          <w:p>
+            <w:r>
+              <w:t>dw-jail-call-analyzer</w:t>
+            </w:r>
+          </w:p>
+        </w:tc>
+        <w:tc>
+          <w:tcPr>
+            <w:tcW w:type="dxa" w:w="5200"/>
+          </w:tcPr>
+          <w:p>
+            <w:r>
+              <w:t>Jail call recording analysis (Securus/GTL/ViaPath); damage assessment, tampering risk, hygiene memo</w:t>
+            </w:r>
+          </w:p>
+        </w:tc>
+        <w:tc>
+          <w:tcPr>
+            <w:tcW w:type="dxa" w:w="1560"/>
+          </w:tcPr>
+          <w:p>
+            <w:r>
+              <w:t>44K</w:t>
             </w:r>
           </w:p>
         </w:tc>
@@ -3621,11 +3575,7 @@
         <w:spacing w:before="200"/>
       </w:pPr>
       <w:r>
-        <w:rPr>
-          <w:sz w:val="22"/>
-          <w:szCs w:val="22"/>
-        </w:rPr>
-        <w:t>Trial Preparation (4)</w:t>
+        <w:t>Trial Preparation (5)</w:t>
       </w:r>
     </w:p>
     <w:tbl>
@@ -4120,6 +4070,38 @@
           </w:p>
         </w:tc>
       </w:tr>
+      <w:tr>
+        <w:tc>
+          <w:tcPr>
+            <w:tcW w:type="dxa" w:w="2600"/>
+          </w:tcPr>
+          <w:p>
+            <w:r>
+              <w:t>dw-trial-day-assistant</w:t>
+            </w:r>
+          </w:p>
+        </w:tc>
+        <w:tc>
+          <w:tcPr>
+            <w:tcW w:type="dxa" w:w="5200"/>
+          </w:tcPr>
+          <w:p>
+            <w:r>
+              <w:t>Real-time trial-day support: objection log, witness scorecard, exhibit tracker, Batson reverse log, mid-trial issue spotter</w:t>
+            </w:r>
+          </w:p>
+        </w:tc>
+        <w:tc>
+          <w:tcPr>
+            <w:tcW w:type="dxa" w:w="1560"/>
+          </w:tcPr>
+          <w:p>
+            <w:r>
+              <w:t>60K</w:t>
+            </w:r>
+          </w:p>
+        </w:tc>
+      </w:tr>
     </w:tbl>
     <w:p>
       <w:pPr>
@@ -4127,27 +4109,7 @@
         <w:spacing w:before="200"/>
       </w:pPr>
       <w:r>
-        <w:rPr>
-          <w:sz w:val="22"/>
-          <w:szCs w:val="22"/>
-        </w:rPr>
-        <w:t xml:space="preserve">Sentencing &amp; </w:t>
-      </w:r>
-      <w:proofErr w:type="gramStart"/>
-      <w:r>
-        <w:rPr>
-          <w:sz w:val="22"/>
-          <w:szCs w:val="22"/>
-        </w:rPr>
-        <w:t>Post-Trial</w:t>
-      </w:r>
-      <w:proofErr w:type="gramEnd"/>
-      <w:r>
-        <w:rPr>
-          <w:sz w:val="22"/>
-          <w:szCs w:val="22"/>
-        </w:rPr>
-        <w:t xml:space="preserve"> (4)</w:t>
+        <w:t>Sentencing &amp; Post-Trial (6)</w:t>
       </w:r>
     </w:p>
     <w:tbl>
@@ -4626,6 +4588,70 @@
           </w:p>
         </w:tc>
       </w:tr>
+      <w:tr>
+        <w:tc>
+          <w:tcPr>
+            <w:tcW w:type="dxa" w:w="2600"/>
+          </w:tcPr>
+          <w:p>
+            <w:r>
+              <w:t>dw-appellate-brief-builder</w:t>
+            </w:r>
+          </w:p>
+        </w:tc>
+        <w:tc>
+          <w:tcPr>
+            <w:tcW w:type="dxa" w:w="5200"/>
+          </w:tcPr>
+          <w:p>
+            <w:r>
+              <w:t>Direct-appeal brief drafting (assignments of error, argument, reply); La. 1st-5th Circuits + Sup. Ct.</w:t>
+            </w:r>
+          </w:p>
+        </w:tc>
+        <w:tc>
+          <w:tcPr>
+            <w:tcW w:type="dxa" w:w="1560"/>
+          </w:tcPr>
+          <w:p>
+            <w:r>
+              <w:t>84K</w:t>
+            </w:r>
+          </w:p>
+        </w:tc>
+      </w:tr>
+      <w:tr>
+        <w:tc>
+          <w:tcPr>
+            <w:tcW w:type="dxa" w:w="2600"/>
+          </w:tcPr>
+          <w:p>
+            <w:r>
+              <w:t>dw-post-conviction-relief</w:t>
+            </w:r>
+          </w:p>
+        </w:tc>
+        <w:tc>
+          <w:tcPr>
+            <w:tcW w:type="dxa" w:w="5200"/>
+          </w:tcPr>
+          <w:p>
+            <w:r>
+              <w:t>PCR (Art. 924-930.10), federal habeas (§ 2254), sentence modification (Art. 881.1)</w:t>
+            </w:r>
+          </w:p>
+        </w:tc>
+        <w:tc>
+          <w:tcPr>
+            <w:tcW w:type="dxa" w:w="1560"/>
+          </w:tcPr>
+          <w:p>
+            <w:r>
+              <w:t>80K</w:t>
+            </w:r>
+          </w:p>
+        </w:tc>
+      </w:tr>
     </w:tbl>
     <w:p>
       <w:pPr>
@@ -4633,11 +4659,7 @@
         <w:spacing w:before="200"/>
       </w:pPr>
       <w:r>
-        <w:rPr>
-          <w:sz w:val="22"/>
-          <w:szCs w:val="22"/>
-        </w:rPr>
-        <w:t>Specialized (6)</w:t>
+        <w:t>Charge-Type Specialists &amp; Specialized (9)</w:t>
       </w:r>
     </w:p>
     <w:tbl>
@@ -4853,7 +4875,6 @@
               <w:bottom w:val="single" w:sz="1" w:space="0" w:color="CCCCCC"/>
               <w:right w:val="single" w:sz="1" w:space="0" w:color="CCCCCC"/>
             </w:tcBorders>
-            <w:shd w:val="clear" w:color="auto" w:fill="F2F7FB"/>
             <w:tcMar>
               <w:top w:w="50" w:type="dxa"/>
               <w:left w:w="80" w:type="dxa"/>
@@ -4876,23 +4897,7 @@
                 <w:sz w:val="20"/>
                 <w:szCs w:val="20"/>
               </w:rPr>
-              <w:t>-</w:t>
-            </w:r>
-            <w:proofErr w:type="spellStart"/>
-            <w:r>
-              <w:rPr>
-                <w:sz w:val="20"/>
-                <w:szCs w:val="20"/>
-              </w:rPr>
-              <w:t>lwop</w:t>
-            </w:r>
-            <w:proofErr w:type="spellEnd"/>
-            <w:r>
-              <w:rPr>
-                <w:sz w:val="20"/>
-                <w:szCs w:val="20"/>
-              </w:rPr>
-              <w:t>-populator</w:t>
+              <w:t>-evidence-placeholder</w:t>
             </w:r>
           </w:p>
         </w:tc>
@@ -4905,21 +4910,20 @@
               <w:bottom w:val="single" w:sz="1" w:space="0" w:color="CCCCCC"/>
               <w:right w:val="single" w:sz="1" w:space="0" w:color="CCCCCC"/>
             </w:tcBorders>
-            <w:shd w:val="clear" w:color="auto" w:fill="F2F7FB"/>
-            <w:tcMar>
-              <w:top w:w="50" w:type="dxa"/>
-              <w:left w:w="80" w:type="dxa"/>
-              <w:bottom w:w="50" w:type="dxa"/>
-              <w:right w:w="80" w:type="dxa"/>
-            </w:tcMar>
-          </w:tcPr>
-          <w:p>
-            <w:r>
-              <w:rPr>
-                <w:sz w:val="20"/>
-                <w:szCs w:val="20"/>
-              </w:rPr>
-              <w:t>LWOP review sheet auto-population</w:t>
+            <w:tcMar>
+              <w:top w:w="50" w:type="dxa"/>
+              <w:left w:w="80" w:type="dxa"/>
+              <w:bottom w:w="50" w:type="dxa"/>
+              <w:right w:w="80" w:type="dxa"/>
+            </w:tcMar>
+          </w:tcPr>
+          <w:p>
+            <w:r>
+              <w:rPr>
+                <w:sz w:val="20"/>
+                <w:szCs w:val="20"/>
+              </w:rPr>
+              <w:t>Media folder placeholder PDF generator</w:t>
             </w:r>
           </w:p>
         </w:tc>
@@ -4932,21 +4936,20 @@
               <w:bottom w:val="single" w:sz="1" w:space="0" w:color="CCCCCC"/>
               <w:right w:val="single" w:sz="1" w:space="0" w:color="CCCCCC"/>
             </w:tcBorders>
-            <w:shd w:val="clear" w:color="auto" w:fill="F2F7FB"/>
-            <w:tcMar>
-              <w:top w:w="50" w:type="dxa"/>
-              <w:left w:w="80" w:type="dxa"/>
-              <w:bottom w:w="50" w:type="dxa"/>
-              <w:right w:w="80" w:type="dxa"/>
-            </w:tcMar>
-          </w:tcPr>
-          <w:p>
-            <w:r>
-              <w:rPr>
-                <w:sz w:val="20"/>
-                <w:szCs w:val="20"/>
-              </w:rPr>
-              <w:t>156K</w:t>
+            <w:tcMar>
+              <w:top w:w="50" w:type="dxa"/>
+              <w:left w:w="80" w:type="dxa"/>
+              <w:bottom w:w="50" w:type="dxa"/>
+              <w:right w:w="80" w:type="dxa"/>
+            </w:tcMar>
+          </w:tcPr>
+          <w:p>
+            <w:r>
+              <w:rPr>
+                <w:sz w:val="20"/>
+                <w:szCs w:val="20"/>
+              </w:rPr>
+              <w:t>24K</w:t>
             </w:r>
           </w:p>
         </w:tc>
@@ -4961,6 +4964,7 @@
               <w:bottom w:val="single" w:sz="1" w:space="0" w:color="CCCCCC"/>
               <w:right w:val="single" w:sz="1" w:space="0" w:color="CCCCCC"/>
             </w:tcBorders>
+            <w:shd w:val="clear" w:color="auto" w:fill="F2F7FB"/>
             <w:tcMar>
               <w:top w:w="50" w:type="dxa"/>
               <w:left w:w="80" w:type="dxa"/>
@@ -4983,7 +4987,7 @@
                 <w:sz w:val="20"/>
                 <w:szCs w:val="20"/>
               </w:rPr>
-              <w:t>-evidence-placeholder</w:t>
+              <w:t>-transcript-router</w:t>
             </w:r>
           </w:p>
         </w:tc>
@@ -4996,20 +5000,21 @@
               <w:bottom w:val="single" w:sz="1" w:space="0" w:color="CCCCCC"/>
               <w:right w:val="single" w:sz="1" w:space="0" w:color="CCCCCC"/>
             </w:tcBorders>
-            <w:tcMar>
-              <w:top w:w="50" w:type="dxa"/>
-              <w:left w:w="80" w:type="dxa"/>
-              <w:bottom w:w="50" w:type="dxa"/>
-              <w:right w:w="80" w:type="dxa"/>
-            </w:tcMar>
-          </w:tcPr>
-          <w:p>
-            <w:r>
-              <w:rPr>
-                <w:sz w:val="20"/>
-                <w:szCs w:val="20"/>
-              </w:rPr>
-              <w:t>Media folder placeholder PDF generator</w:t>
+            <w:shd w:val="clear" w:color="auto" w:fill="F2F7FB"/>
+            <w:tcMar>
+              <w:top w:w="50" w:type="dxa"/>
+              <w:left w:w="80" w:type="dxa"/>
+              <w:bottom w:w="50" w:type="dxa"/>
+              <w:right w:w="80" w:type="dxa"/>
+            </w:tcMar>
+          </w:tcPr>
+          <w:p>
+            <w:r>
+              <w:rPr>
+                <w:sz w:val="20"/>
+                <w:szCs w:val="20"/>
+              </w:rPr>
+              <w:t>Parish-based transcription pipeline router</w:t>
             </w:r>
           </w:p>
         </w:tc>
@@ -5022,20 +5027,21 @@
               <w:bottom w:val="single" w:sz="1" w:space="0" w:color="CCCCCC"/>
               <w:right w:val="single" w:sz="1" w:space="0" w:color="CCCCCC"/>
             </w:tcBorders>
-            <w:tcMar>
-              <w:top w:w="50" w:type="dxa"/>
-              <w:left w:w="80" w:type="dxa"/>
-              <w:bottom w:w="50" w:type="dxa"/>
-              <w:right w:w="80" w:type="dxa"/>
-            </w:tcMar>
-          </w:tcPr>
-          <w:p>
-            <w:r>
-              <w:rPr>
-                <w:sz w:val="20"/>
-                <w:szCs w:val="20"/>
-              </w:rPr>
-              <w:t>24K</w:t>
+            <w:shd w:val="clear" w:color="auto" w:fill="F2F7FB"/>
+            <w:tcMar>
+              <w:top w:w="50" w:type="dxa"/>
+              <w:left w:w="80" w:type="dxa"/>
+              <w:bottom w:w="50" w:type="dxa"/>
+              <w:right w:w="80" w:type="dxa"/>
+            </w:tcMar>
+          </w:tcPr>
+          <w:p>
+            <w:r>
+              <w:rPr>
+                <w:sz w:val="20"/>
+                <w:szCs w:val="20"/>
+              </w:rPr>
+              <w:t>4K</w:t>
             </w:r>
           </w:p>
         </w:tc>
@@ -5050,7 +5056,6 @@
               <w:bottom w:val="single" w:sz="1" w:space="0" w:color="CCCCCC"/>
               <w:right w:val="single" w:sz="1" w:space="0" w:color="CCCCCC"/>
             </w:tcBorders>
-            <w:shd w:val="clear" w:color="auto" w:fill="F2F7FB"/>
             <w:tcMar>
               <w:top w:w="50" w:type="dxa"/>
               <w:left w:w="80" w:type="dxa"/>
@@ -5073,8 +5078,17 @@
                 <w:sz w:val="20"/>
                 <w:szCs w:val="20"/>
               </w:rPr>
-              <w:t>-transcript-router</w:t>
-            </w:r>
+              <w:t>-transcript-pipeline-</w:t>
+            </w:r>
+            <w:proofErr w:type="spellStart"/>
+            <w:r>
+              <w:rPr>
+                <w:sz w:val="20"/>
+                <w:szCs w:val="20"/>
+              </w:rPr>
+              <w:t>calcasieu</w:t>
+            </w:r>
+            <w:proofErr w:type="spellEnd"/>
           </w:p>
         </w:tc>
         <w:tc>
@@ -5086,21 +5100,29 @@
               <w:bottom w:val="single" w:sz="1" w:space="0" w:color="CCCCCC"/>
               <w:right w:val="single" w:sz="1" w:space="0" w:color="CCCCCC"/>
             </w:tcBorders>
-            <w:shd w:val="clear" w:color="auto" w:fill="F2F7FB"/>
-            <w:tcMar>
-              <w:top w:w="50" w:type="dxa"/>
-              <w:left w:w="80" w:type="dxa"/>
-              <w:bottom w:w="50" w:type="dxa"/>
-              <w:right w:w="80" w:type="dxa"/>
-            </w:tcMar>
-          </w:tcPr>
-          <w:p>
-            <w:r>
-              <w:rPr>
-                <w:sz w:val="20"/>
-                <w:szCs w:val="20"/>
-              </w:rPr>
-              <w:t>Parish-based transcription pipeline router</w:t>
+            <w:tcMar>
+              <w:top w:w="50" w:type="dxa"/>
+              <w:left w:w="80" w:type="dxa"/>
+              <w:bottom w:w="50" w:type="dxa"/>
+              <w:right w:w="80" w:type="dxa"/>
+            </w:tcMar>
+          </w:tcPr>
+          <w:p>
+            <w:proofErr w:type="spellStart"/>
+            <w:r>
+              <w:rPr>
+                <w:sz w:val="20"/>
+                <w:szCs w:val="20"/>
+              </w:rPr>
+              <w:t>JusticeText</w:t>
+            </w:r>
+            <w:proofErr w:type="spellEnd"/>
+            <w:r>
+              <w:rPr>
+                <w:sz w:val="20"/>
+                <w:szCs w:val="20"/>
+              </w:rPr>
+              <w:t xml:space="preserve"> pipeline (Calcasieu Parish)</w:t>
             </w:r>
           </w:p>
         </w:tc>
@@ -5113,21 +5135,20 @@
               <w:bottom w:val="single" w:sz="1" w:space="0" w:color="CCCCCC"/>
               <w:right w:val="single" w:sz="1" w:space="0" w:color="CCCCCC"/>
             </w:tcBorders>
-            <w:shd w:val="clear" w:color="auto" w:fill="F2F7FB"/>
-            <w:tcMar>
-              <w:top w:w="50" w:type="dxa"/>
-              <w:left w:w="80" w:type="dxa"/>
-              <w:bottom w:w="50" w:type="dxa"/>
-              <w:right w:w="80" w:type="dxa"/>
-            </w:tcMar>
-          </w:tcPr>
-          <w:p>
-            <w:r>
-              <w:rPr>
-                <w:sz w:val="20"/>
-                <w:szCs w:val="20"/>
-              </w:rPr>
-              <w:t>4K</w:t>
+            <w:tcMar>
+              <w:top w:w="50" w:type="dxa"/>
+              <w:left w:w="80" w:type="dxa"/>
+              <w:bottom w:w="50" w:type="dxa"/>
+              <w:right w:w="80" w:type="dxa"/>
+            </w:tcMar>
+          </w:tcPr>
+          <w:p>
+            <w:r>
+              <w:rPr>
+                <w:sz w:val="20"/>
+                <w:szCs w:val="20"/>
+              </w:rPr>
+              <w:t>16K</w:t>
             </w:r>
           </w:p>
         </w:tc>
@@ -5142,6 +5163,7 @@
               <w:bottom w:val="single" w:sz="1" w:space="0" w:color="CCCCCC"/>
               <w:right w:val="single" w:sz="1" w:space="0" w:color="CCCCCC"/>
             </w:tcBorders>
+            <w:shd w:val="clear" w:color="auto" w:fill="F2F7FB"/>
             <w:tcMar>
               <w:top w:w="50" w:type="dxa"/>
               <w:left w:w="80" w:type="dxa"/>
@@ -5164,17 +5186,8 @@
                 <w:sz w:val="20"/>
                 <w:szCs w:val="20"/>
               </w:rPr>
-              <w:t>-transcript-pipeline-</w:t>
-            </w:r>
-            <w:proofErr w:type="spellStart"/>
-            <w:r>
-              <w:rPr>
-                <w:sz w:val="20"/>
-                <w:szCs w:val="20"/>
-              </w:rPr>
-              <w:t>calcasieu</w:t>
-            </w:r>
-            <w:proofErr w:type="spellEnd"/>
+              <w:t>-transcript-pipeline-rev</w:t>
+            </w:r>
           </w:p>
         </w:tc>
         <w:tc>
@@ -5186,29 +5199,21 @@
               <w:bottom w:val="single" w:sz="1" w:space="0" w:color="CCCCCC"/>
               <w:right w:val="single" w:sz="1" w:space="0" w:color="CCCCCC"/>
             </w:tcBorders>
-            <w:tcMar>
-              <w:top w:w="50" w:type="dxa"/>
-              <w:left w:w="80" w:type="dxa"/>
-              <w:bottom w:w="50" w:type="dxa"/>
-              <w:right w:w="80" w:type="dxa"/>
-            </w:tcMar>
-          </w:tcPr>
-          <w:p>
-            <w:proofErr w:type="spellStart"/>
-            <w:r>
-              <w:rPr>
-                <w:sz w:val="20"/>
-                <w:szCs w:val="20"/>
-              </w:rPr>
-              <w:t>JusticeText</w:t>
-            </w:r>
-            <w:proofErr w:type="spellEnd"/>
-            <w:r>
-              <w:rPr>
-                <w:sz w:val="20"/>
-                <w:szCs w:val="20"/>
-              </w:rPr>
-              <w:t xml:space="preserve"> pipeline (Calcasieu Parish)</w:t>
+            <w:shd w:val="clear" w:color="auto" w:fill="F2F7FB"/>
+            <w:tcMar>
+              <w:top w:w="50" w:type="dxa"/>
+              <w:left w:w="80" w:type="dxa"/>
+              <w:bottom w:w="50" w:type="dxa"/>
+              <w:right w:w="80" w:type="dxa"/>
+            </w:tcMar>
+          </w:tcPr>
+          <w:p>
+            <w:r>
+              <w:rPr>
+                <w:sz w:val="20"/>
+                <w:szCs w:val="20"/>
+              </w:rPr>
+              <w:t>Rev.com pipeline (all other parishes)</w:t>
             </w:r>
           </w:p>
         </w:tc>
@@ -5221,20 +5226,21 @@
               <w:bottom w:val="single" w:sz="1" w:space="0" w:color="CCCCCC"/>
               <w:right w:val="single" w:sz="1" w:space="0" w:color="CCCCCC"/>
             </w:tcBorders>
-            <w:tcMar>
-              <w:top w:w="50" w:type="dxa"/>
-              <w:left w:w="80" w:type="dxa"/>
-              <w:bottom w:w="50" w:type="dxa"/>
-              <w:right w:w="80" w:type="dxa"/>
-            </w:tcMar>
-          </w:tcPr>
-          <w:p>
-            <w:r>
-              <w:rPr>
-                <w:sz w:val="20"/>
-                <w:szCs w:val="20"/>
-              </w:rPr>
-              <w:t>16K</w:t>
+            <w:shd w:val="clear" w:color="auto" w:fill="F2F7FB"/>
+            <w:tcMar>
+              <w:top w:w="50" w:type="dxa"/>
+              <w:left w:w="80" w:type="dxa"/>
+              <w:bottom w:w="50" w:type="dxa"/>
+              <w:right w:w="80" w:type="dxa"/>
+            </w:tcMar>
+          </w:tcPr>
+          <w:p>
+            <w:r>
+              <w:rPr>
+                <w:sz w:val="20"/>
+                <w:szCs w:val="20"/>
+              </w:rPr>
+              <w:t>24K</w:t>
             </w:r>
           </w:p>
         </w:tc>
@@ -5242,91 +5248,127 @@
       <w:tr>
         <w:tc>
           <w:tcPr>
-            <w:tcW w:w="2600" w:type="dxa"/>
-            <w:tcBorders>
-              <w:top w:val="single" w:sz="1" w:space="0" w:color="CCCCCC"/>
-              <w:left w:val="single" w:sz="1" w:space="0" w:color="CCCCCC"/>
-              <w:bottom w:val="single" w:sz="1" w:space="0" w:color="CCCCCC"/>
-              <w:right w:val="single" w:sz="1" w:space="0" w:color="CCCCCC"/>
-            </w:tcBorders>
-            <w:shd w:val="clear" w:color="auto" w:fill="F2F7FB"/>
-            <w:tcMar>
-              <w:top w:w="50" w:type="dxa"/>
-              <w:left w:w="80" w:type="dxa"/>
-              <w:bottom w:w="50" w:type="dxa"/>
-              <w:right w:w="80" w:type="dxa"/>
-            </w:tcMar>
-          </w:tcPr>
-          <w:p>
-            <w:proofErr w:type="spellStart"/>
-            <w:r>
-              <w:rPr>
-                <w:sz w:val="20"/>
-                <w:szCs w:val="20"/>
-              </w:rPr>
-              <w:t>dw</w:t>
-            </w:r>
-            <w:proofErr w:type="spellEnd"/>
-            <w:r>
-              <w:rPr>
-                <w:sz w:val="20"/>
-                <w:szCs w:val="20"/>
-              </w:rPr>
-              <w:t>-transcript-pipeline-rev</w:t>
-            </w:r>
-          </w:p>
-        </w:tc>
-        <w:tc>
-          <w:tcPr>
-            <w:tcW w:w="5200" w:type="dxa"/>
-            <w:tcBorders>
-              <w:top w:val="single" w:sz="1" w:space="0" w:color="CCCCCC"/>
-              <w:left w:val="single" w:sz="1" w:space="0" w:color="CCCCCC"/>
-              <w:bottom w:val="single" w:sz="1" w:space="0" w:color="CCCCCC"/>
-              <w:right w:val="single" w:sz="1" w:space="0" w:color="CCCCCC"/>
-            </w:tcBorders>
-            <w:shd w:val="clear" w:color="auto" w:fill="F2F7FB"/>
-            <w:tcMar>
-              <w:top w:w="50" w:type="dxa"/>
-              <w:left w:w="80" w:type="dxa"/>
-              <w:bottom w:w="50" w:type="dxa"/>
-              <w:right w:w="80" w:type="dxa"/>
-            </w:tcMar>
-          </w:tcPr>
-          <w:p>
-            <w:r>
-              <w:rPr>
-                <w:sz w:val="20"/>
-                <w:szCs w:val="20"/>
-              </w:rPr>
-              <w:t>Rev.com pipeline (all other parishes)</w:t>
-            </w:r>
-          </w:p>
-        </w:tc>
-        <w:tc>
-          <w:tcPr>
-            <w:tcW w:w="1560" w:type="dxa"/>
-            <w:tcBorders>
-              <w:top w:val="single" w:sz="1" w:space="0" w:color="CCCCCC"/>
-              <w:left w:val="single" w:sz="1" w:space="0" w:color="CCCCCC"/>
-              <w:bottom w:val="single" w:sz="1" w:space="0" w:color="CCCCCC"/>
-              <w:right w:val="single" w:sz="1" w:space="0" w:color="CCCCCC"/>
-            </w:tcBorders>
-            <w:shd w:val="clear" w:color="auto" w:fill="F2F7FB"/>
-            <w:tcMar>
-              <w:top w:w="50" w:type="dxa"/>
-              <w:left w:w="80" w:type="dxa"/>
-              <w:bottom w:w="50" w:type="dxa"/>
-              <w:right w:w="80" w:type="dxa"/>
-            </w:tcMar>
-          </w:tcPr>
-          <w:p>
-            <w:r>
-              <w:rPr>
-                <w:sz w:val="20"/>
-                <w:szCs w:val="20"/>
-              </w:rPr>
-              <w:t>24K</w:t>
+            <w:tcW w:type="dxa" w:w="2600"/>
+          </w:tcPr>
+          <w:p>
+            <w:r>
+              <w:t>dw-violent-crime-specialist</w:t>
+            </w:r>
+          </w:p>
+        </w:tc>
+        <w:tc>
+          <w:tcPr>
+            <w:tcW w:type="dxa" w:w="5200"/>
+          </w:tcPr>
+          <w:p>
+            <w:r>
+              <w:t>Homicide, manslaughter, agg battery/assault, armed robbery, kidnapping, home invasion; specific intent doctrine, self-defense (no duty to retreat), felony-murder, responsive verdicts</w:t>
+            </w:r>
+          </w:p>
+        </w:tc>
+        <w:tc>
+          <w:tcPr>
+            <w:tcW w:type="dxa" w:w="1560"/>
+          </w:tcPr>
+          <w:p>
+            <w:r>
+              <w:t>48K</w:t>
+            </w:r>
+          </w:p>
+        </w:tc>
+      </w:tr>
+      <w:tr>
+        <w:tc>
+          <w:tcPr>
+            <w:tcW w:type="dxa" w:w="2600"/>
+          </w:tcPr>
+          <w:p>
+            <w:r>
+              <w:t>dw-drug-offense-specialist</w:t>
+            </w:r>
+          </w:p>
+        </w:tc>
+        <w:tc>
+          <w:tcPr>
+            <w:tcW w:type="dxa" w:w="5200"/>
+          </w:tcPr>
+          <w:p>
+            <w:r>
+              <w:t>CDS schedules, possession, distribution, PWITD, drug court eligibility</w:t>
+            </w:r>
+          </w:p>
+        </w:tc>
+        <w:tc>
+          <w:tcPr>
+            <w:tcW w:type="dxa" w:w="1560"/>
+          </w:tcPr>
+          <w:p>
+            <w:r>
+              <w:t>44K</w:t>
+            </w:r>
+          </w:p>
+        </w:tc>
+      </w:tr>
+      <w:tr>
+        <w:tc>
+          <w:tcPr>
+            <w:tcW w:type="dxa" w:w="2600"/>
+          </w:tcPr>
+          <w:p>
+            <w:r>
+              <w:t>dw-dwi-specialist</w:t>
+            </w:r>
+          </w:p>
+        </w:tc>
+        <w:tc>
+          <w:tcPr>
+            <w:tcW w:type="dxa" w:w="5200"/>
+          </w:tcPr>
+          <w:p>
+            <w:r>
+              <w:t>DWI/OWI, vehicular homicide; field sobriety, BAC, refusal sanctions</w:t>
+            </w:r>
+          </w:p>
+        </w:tc>
+        <w:tc>
+          <w:tcPr>
+            <w:tcW w:type="dxa" w:w="1560"/>
+          </w:tcPr>
+          <w:p>
+            <w:r>
+              <w:t>40K</w:t>
+            </w:r>
+          </w:p>
+        </w:tc>
+      </w:tr>
+      <w:tr>
+        <w:tc>
+          <w:tcPr>
+            <w:tcW w:type="dxa" w:w="2600"/>
+          </w:tcPr>
+          <w:p>
+            <w:r>
+              <w:t>dw-firearms-specialist</w:t>
+            </w:r>
+          </w:p>
+        </w:tc>
+        <w:tc>
+          <w:tcPr>
+            <w:tcW w:type="dxa" w:w="5200"/>
+          </w:tcPr>
+          <w:p>
+            <w:r>
+              <w:t>State and federal firearms (felon-in-possession, § 924(c) enhancement, La. R.S. 14:64.3)</w:t>
+            </w:r>
+          </w:p>
+        </w:tc>
+        <w:tc>
+          <w:tcPr>
+            <w:tcW w:type="dxa" w:w="1560"/>
+          </w:tcPr>
+          <w:p>
+            <w:r>
+              <w:t>44K</w:t>
             </w:r>
           </w:p>
         </w:tc>
@@ -8942,11 +8984,7 @@
         <w:jc w:val="center"/>
       </w:pPr>
       <w:r>
-        <w:rPr>
-          <w:i/>
-          <w:iCs/>
-        </w:rPr>
-        <w:t>End of Updated Skill Map — March 21, 2026</w:t>
+        <w:t>End of Updated Skill Map — May 2, 2026</w:t>
       </w:r>
     </w:p>
     <w:sectPr>

</xml_diff>